<commit_message>
Se actualiza cambio de turno sencillo. Sabados bloqueados tambien
</commit_message>
<xml_diff>
--- a/requisito doblada.docx
+++ b/requisito doblada.docx
@@ -4,6 +4,9 @@
   <w:body>
     <w:p>
       <w:r>
+        <w:rPr>
+          <w:noProof/>
+        </w:rPr>
         <w:drawing>
           <wp:inline distT="0" distB="0" distL="0" distR="0" wp14:anchorId="3EFB6466" wp14:editId="4CC03C5F">
             <wp:extent cx="5612130" cy="2855595"/>
@@ -43,6 +46,9 @@
     </w:p>
     <w:p>
       <w:r>
+        <w:rPr>
+          <w:noProof/>
+        </w:rPr>
         <w:drawing>
           <wp:inline distT="0" distB="0" distL="0" distR="0" wp14:anchorId="64D5E49A" wp14:editId="4FA09616">
             <wp:extent cx="5612130" cy="3611245"/>
@@ -82,6 +88,9 @@
     </w:p>
     <w:p>
       <w:r>
+        <w:rPr>
+          <w:noProof/>
+        </w:rPr>
         <w:lastRenderedPageBreak/>
         <w:drawing>
           <wp:inline distT="0" distB="0" distL="0" distR="0" wp14:anchorId="0A47F295" wp14:editId="206FE9DE">
@@ -122,6 +131,9 @@
     </w:p>
     <w:p>
       <w:r>
+        <w:rPr>
+          <w:noProof/>
+        </w:rPr>
         <w:lastRenderedPageBreak/>
         <w:drawing>
           <wp:inline distT="0" distB="0" distL="0" distR="0" wp14:anchorId="799ED585" wp14:editId="43C77DF2">
@@ -168,6 +180,9 @@
     </w:p>
     <w:p>
       <w:r>
+        <w:rPr>
+          <w:noProof/>
+        </w:rPr>
         <w:lastRenderedPageBreak/>
         <w:drawing>
           <wp:inline distT="0" distB="0" distL="0" distR="0" wp14:anchorId="26969858" wp14:editId="36A6B82E">
@@ -237,29 +252,10 @@
         </w:numPr>
       </w:pPr>
       <w:r>
-        <w:t xml:space="preserve">Una </w:t>
-      </w:r>
-      <w:proofErr w:type="gramStart"/>
-      <w:r>
-        <w:t>doblada</w:t>
-      </w:r>
-      <w:r>
-        <w:t xml:space="preserve">  ocurre</w:t>
-      </w:r>
-      <w:proofErr w:type="gramEnd"/>
-      <w:r>
-        <w:t xml:space="preserve"> cuando un explorador decide no trabajar una jornada</w:t>
-      </w:r>
-      <w:r>
-        <w:t xml:space="preserve"> </w:t>
-      </w:r>
-      <w:proofErr w:type="gramStart"/>
-      <w:r>
-        <w:t>especifica(</w:t>
-      </w:r>
-      <w:proofErr w:type="gramEnd"/>
-      <w:r>
-        <w:t>Am o PM) según la jornada que tiene el día que quiere que le cambien</w:t>
+        <w:t>Una doblada  ocurre cuando un explorador decide no trabajar una jornada</w:t>
+      </w:r>
+      <w:r>
+        <w:t xml:space="preserve"> especifica(Am o PM) según la jornada que tiene el día que quiere que le cambien</w:t>
       </w:r>
     </w:p>
     <w:p>
@@ -324,15 +320,7 @@
     </w:p>
     <w:p>
       <w:r>
-        <w:t xml:space="preserve">Pago de </w:t>
-      </w:r>
-      <w:proofErr w:type="gramStart"/>
-      <w:r>
-        <w:t>deudas(</w:t>
-      </w:r>
-      <w:proofErr w:type="gramEnd"/>
-      <w:r>
-        <w:t>Regla universal):</w:t>
+        <w:t>Pago de deudas(Regla universal):</w:t>
       </w:r>
     </w:p>
     <w:p>
@@ -428,13 +416,8 @@
         <w:t>Se genera 30 minutos de deuda</w:t>
       </w:r>
       <w:r>
-        <w:t xml:space="preserve"> con la corporación, esto es </w:t>
-      </w:r>
-      <w:proofErr w:type="spellStart"/>
-      <w:r>
-        <w:t>acomulado</w:t>
-      </w:r>
-      <w:proofErr w:type="spellEnd"/>
+        <w:t xml:space="preserve"> con la corporación, esto es acomulado</w:t>
+      </w:r>
     </w:p>
     <w:p>
       <w:pPr>
@@ -511,19 +494,11 @@
           <w:lang w:val="pt-BR"/>
         </w:rPr>
       </w:pPr>
-      <w:proofErr w:type="spellStart"/>
       <w:r>
         <w:rPr>
           <w:lang w:val="pt-BR"/>
         </w:rPr>
-        <w:t>No</w:t>
-      </w:r>
-      <w:proofErr w:type="spellEnd"/>
-      <w:r>
-        <w:rPr>
-          <w:lang w:val="pt-BR"/>
-        </w:rPr>
-        <w:t xml:space="preserve"> se </w:t>
+        <w:t xml:space="preserve">No se </w:t>
       </w:r>
       <w:r>
         <w:rPr>
@@ -556,15 +531,7 @@
         <w:t>Solo es modificada cuando se</w:t>
       </w:r>
       <w:r>
-        <w:t xml:space="preserve"> generan cambio de turnos sencillos o cuando han </w:t>
-      </w:r>
-      <w:proofErr w:type="spellStart"/>
-      <w:r>
-        <w:t>realizdo</w:t>
-      </w:r>
-      <w:proofErr w:type="spellEnd"/>
-      <w:r>
-        <w:t xml:space="preserve"> cambio de turnos permanentes. Aquí puede que en días específicos aparezca una jornada diferente a la jornada predeterminada</w:t>
+        <w:t xml:space="preserve"> generan cambio de turnos sencillos o cuando han realizdo cambio de turnos permanentes. Aquí puede que en días específicos aparezca una jornada diferente a la jornada predeterminada</w:t>
       </w:r>
     </w:p>
     <w:p>
@@ -612,15 +579,7 @@
         </w:numPr>
       </w:pPr>
       <w:r>
-        <w:t xml:space="preserve">Tener doblada, trabaja Am y </w:t>
-      </w:r>
-      <w:proofErr w:type="gramStart"/>
-      <w:r>
-        <w:t>PM(</w:t>
-      </w:r>
-      <w:proofErr w:type="gramEnd"/>
-      <w:r>
-        <w:t>doblada)</w:t>
+        <w:t>Tener doblada, trabaja Am y PM(doblada)</w:t>
       </w:r>
     </w:p>
     <w:p>
@@ -632,10 +591,7 @@
         </w:numPr>
       </w:pPr>
       <w:r>
-        <w:t>S</w:t>
-      </w:r>
-      <w:r>
-        <w:t>i estoy en am cargan todos los pm de esa jornada, excepto los que tienen doblada</w:t>
+        <w:t>Si estoy en am cargan todos los pm de esa jornada, excepto los que tienen doblada</w:t>
       </w:r>
     </w:p>
     <w:p>
@@ -647,10 +603,7 @@
         </w:numPr>
       </w:pPr>
       <w:r>
-        <w:t>S</w:t>
-      </w:r>
-      <w:r>
-        <w:t>i estoy en pm cargan todos los am de esa jornada, excepto los que tiene doblada</w:t>
+        <w:t>Si estoy en pm cargan todos los am de esa jornada, excepto los que tiene doblada</w:t>
       </w:r>
     </w:p>
     <w:p>
@@ -668,10 +621,7 @@
         </w:numPr>
       </w:pPr>
       <w:r>
-        <w:t>S</w:t>
-      </w:r>
-      <w:r>
-        <w:t>i estoy en doblada me tiene que aparecer ambas jornadas, excepto los que tienen dobladas ese día</w:t>
+        <w:t>Si estoy en doblada me tiene que aparecer ambas jornadas, excepto los que tienen dobladas ese día</w:t>
       </w:r>
     </w:p>
     <w:p/>
@@ -733,21 +683,7 @@
           <w:b/>
           <w:bCs/>
         </w:rPr>
-        <w:t>Cambio de turno</w:t>
-      </w:r>
-      <w:r>
-        <w:rPr>
-          <w:b/>
-          <w:bCs/>
-        </w:rPr>
-        <w:t xml:space="preserve"> permanente</w:t>
-      </w:r>
-      <w:r>
-        <w:rPr>
-          <w:b/>
-          <w:bCs/>
-        </w:rPr>
-        <w:t>:</w:t>
+        <w:t>Cambio de turno permanente:</w:t>
       </w:r>
     </w:p>
     <w:p>
@@ -759,13 +695,7 @@
         </w:numPr>
       </w:pPr>
       <w:r>
-        <w:t xml:space="preserve">Lo que ya </w:t>
-      </w:r>
-      <w:r>
-        <w:t>este fijado</w:t>
-      </w:r>
-      <w:r>
-        <w:t xml:space="preserve"> en cambio de turno permanente</w:t>
+        <w:t>Lo que ya este fijado en cambio de turno permanente</w:t>
       </w:r>
     </w:p>
     <w:p/>
@@ -952,13 +882,8 @@
         <w:t xml:space="preserve">siguiente. Ejemplo. Yo Manuel trabajo el 18/12/2025 en jornada am. Esa es mi jornada para ese día y Ronal trabaja en Pm ese día.  Como yo hago la solicitud. Debo poner también que día le voy a pagar esa doblada a </w:t>
       </w:r>
       <w:r>
-        <w:t>Ronal, supongamos que es el 25/12/</w:t>
-      </w:r>
-      <w:proofErr w:type="gramStart"/>
-      <w:r>
-        <w:t>2025  y</w:t>
-      </w:r>
-      <w:proofErr w:type="gramEnd"/>
+        <w:t>Ronal, supongamos que es el 25/12/2025  y</w:t>
+      </w:r>
       <w:r>
         <w:t xml:space="preserve"> si </w:t>
       </w:r>
@@ -999,19 +924,7 @@
         <w:t xml:space="preserve">Segundo Caso: </w:t>
       </w:r>
       <w:r>
-        <w:t xml:space="preserve">El explorador </w:t>
-      </w:r>
-      <w:r>
-        <w:t>el día</w:t>
-      </w:r>
-      <w:r>
-        <w:t xml:space="preserve"> </w:t>
-      </w:r>
-      <w:r>
-        <w:t>que va a hacer la solicitud tiene una</w:t>
-      </w:r>
-      <w:r>
-        <w:t xml:space="preserve"> doblada</w:t>
+        <w:t>El explorador el día que va a hacer la solicitud tiene una doblada</w:t>
       </w:r>
     </w:p>
     <w:p>
@@ -1056,15 +969,7 @@
         <w:t>trabajar el</w:t>
       </w:r>
       <w:r>
-        <w:t xml:space="preserve"> 18/12/</w:t>
-      </w:r>
-      <w:proofErr w:type="gramStart"/>
-      <w:r>
-        <w:t>2025  solo</w:t>
-      </w:r>
-      <w:proofErr w:type="gramEnd"/>
-      <w:r>
-        <w:t xml:space="preserve"> trabaje media jornada. Entonces de esa misma fecha busca a alguien que le trabaje media jornada. Según la jornada que el no quiere trabajar. Ejemplo:</w:t>
+        <w:t xml:space="preserve"> 18/12/2025  solo trabaje media jornada. Entonces de esa misma fecha busca a alguien que le trabaje media jornada. Según la jornada que el no quiere trabajar. Ejemplo:</w:t>
       </w:r>
     </w:p>
     <w:p>
@@ -1092,44 +997,23 @@
         <w:t xml:space="preserve"> le toca trabajar AM/PM, entonces busca que alguien le trabaje la media jornada que es la Am. En ese caso tendrá que buscar a alguien que trabaje en PM. Entonces encontró a Ronal que ese día trabaja en Pm</w:t>
       </w:r>
       <w:r>
-        <w:t>. Le manda la solicitud a Ronal, donde Ronal lo cubre siempre y cuando El explorador “</w:t>
-      </w:r>
-      <w:proofErr w:type="gramStart"/>
-      <w:r>
-        <w:t>X”  cubra</w:t>
-      </w:r>
-      <w:proofErr w:type="gramEnd"/>
-      <w:r>
-        <w:t xml:space="preserve"> a Ronal el día que acordaron</w:t>
+        <w:t>. Le manda la solicitud a Ronal, donde Ronal lo cubre siempre y cuando El explorador “X”  cubra a Ronal el día que acordaron</w:t>
+      </w:r>
+      <w:r>
+        <w:t xml:space="preserve"> y </w:t>
+      </w:r>
+      <w:r>
+        <w:t xml:space="preserve"> si, sí están de acuerdo entonces ese día se aprueba</w:t>
+      </w:r>
+      <w:r>
+        <w:t xml:space="preserve">. Entonces ese </w:t>
+      </w:r>
+      <w:r>
+        <w:t>día el</w:t>
       </w:r>
       <w:r>
         <w:t xml:space="preserve"> </w:t>
       </w:r>
-      <w:proofErr w:type="gramStart"/>
-      <w:r>
-        <w:t xml:space="preserve">y </w:t>
-      </w:r>
-      <w:r>
-        <w:t xml:space="preserve"> </w:t>
-      </w:r>
-      <w:proofErr w:type="spellStart"/>
-      <w:r>
-        <w:t>si</w:t>
-      </w:r>
-      <w:proofErr w:type="spellEnd"/>
-      <w:proofErr w:type="gramEnd"/>
-      <w:r>
-        <w:t>, sí están de acuerdo entonces ese día se aprueba</w:t>
-      </w:r>
-      <w:r>
-        <w:t xml:space="preserve">. Entonces ese </w:t>
-      </w:r>
-      <w:r>
-        <w:t>día el</w:t>
-      </w:r>
-      <w:r>
-        <w:t xml:space="preserve"> </w:t>
-      </w:r>
       <w:r>
         <w:t>explorador “</w:t>
       </w:r>
@@ -1159,30 +1043,7 @@
           <w:b/>
           <w:bCs/>
         </w:rPr>
-        <w:t xml:space="preserve">Caso crítico: </w:t>
-      </w:r>
-      <w:proofErr w:type="spellStart"/>
-      <w:r>
-        <w:rPr>
-          <w:b/>
-          <w:bCs/>
-        </w:rPr>
-        <w:t>coincidência</w:t>
-      </w:r>
-      <w:proofErr w:type="spellEnd"/>
-      <w:r>
-        <w:rPr>
-          <w:b/>
-          <w:bCs/>
-        </w:rPr>
-        <w:t xml:space="preserve"> de jornadas (AM→AM / PM→PM)</w:t>
-      </w:r>
-      <w:r>
-        <w:rPr>
-          <w:b/>
-          <w:bCs/>
-        </w:rPr>
-        <w:t xml:space="preserve"> para el día que el explorador “X” deba pagar la</w:t>
+        <w:t>Caso crítico: coincidência de jornadas (AM→AM / PM→PM) para el día que el explorador “X” deba pagar la</w:t>
       </w:r>
       <w:r>
         <w:rPr>
@@ -1377,14 +1238,7 @@
           <w:b/>
           <w:bCs/>
         </w:rPr>
-        <w:t>Reglas de carga para solicitudes de cesión</w:t>
-      </w:r>
-      <w:r>
-        <w:rPr>
-          <w:b/>
-          <w:bCs/>
-        </w:rPr>
-        <w:t>:</w:t>
+        <w:t>Reglas de carga para solicitudes de cesión:</w:t>
       </w:r>
     </w:p>
     <w:p>
@@ -1704,37 +1558,12 @@
           <w:bCs/>
         </w:rPr>
       </w:pPr>
-      <w:proofErr w:type="spellStart"/>
-      <w:r>
-        <w:rPr>
-          <w:b/>
-          <w:bCs/>
-        </w:rPr>
-        <w:t>System</w:t>
-      </w:r>
-      <w:proofErr w:type="spellEnd"/>
-      <w:r>
-        <w:rPr>
-          <w:b/>
-          <w:bCs/>
-        </w:rPr>
-        <w:t xml:space="preserve"> </w:t>
-      </w:r>
-      <w:proofErr w:type="spellStart"/>
-      <w:r>
-        <w:rPr>
-          <w:b/>
-          <w:bCs/>
-        </w:rPr>
-        <w:t>Prompt</w:t>
-      </w:r>
-      <w:proofErr w:type="spellEnd"/>
-      <w:r>
-        <w:rPr>
-          <w:b/>
-          <w:bCs/>
-        </w:rPr>
-        <w:t>: Motor de Reglas de Turnos y Dobladas (Exploradores)</w:t>
+      <w:r>
+        <w:rPr>
+          <w:b/>
+          <w:bCs/>
+        </w:rPr>
+        <w:t>System Prompt: Motor de Reglas de Turnos y Dobladas (Exploradores)</w:t>
       </w:r>
     </w:p>
     <w:p>
@@ -1793,49 +1622,7 @@
         <w:rPr>
           <w:lang w:val="pt-BR"/>
         </w:rPr>
-        <w:t xml:space="preserve"> Turno </w:t>
-      </w:r>
-      <w:proofErr w:type="spellStart"/>
-      <w:r>
-        <w:rPr>
-          <w:lang w:val="pt-BR"/>
-        </w:rPr>
-        <w:t>fijo</w:t>
-      </w:r>
-      <w:proofErr w:type="spellEnd"/>
-      <w:r>
-        <w:rPr>
-          <w:lang w:val="pt-BR"/>
-        </w:rPr>
-        <w:t xml:space="preserve"> (AM o PM) </w:t>
-      </w:r>
-      <w:proofErr w:type="spellStart"/>
-      <w:r>
-        <w:rPr>
-          <w:lang w:val="pt-BR"/>
-        </w:rPr>
-        <w:t>asignado</w:t>
-      </w:r>
-      <w:proofErr w:type="spellEnd"/>
-      <w:r>
-        <w:rPr>
-          <w:lang w:val="pt-BR"/>
-        </w:rPr>
-        <w:t xml:space="preserve"> a </w:t>
-      </w:r>
-      <w:proofErr w:type="spellStart"/>
-      <w:r>
-        <w:rPr>
-          <w:lang w:val="pt-BR"/>
-        </w:rPr>
-        <w:t>un</w:t>
-      </w:r>
-      <w:proofErr w:type="spellEnd"/>
-      <w:r>
-        <w:rPr>
-          <w:lang w:val="pt-BR"/>
-        </w:rPr>
-        <w:t xml:space="preserve"> explorador. </w:t>
+        <w:t xml:space="preserve"> Turno fijo (AM o PM) asignado a un explorador. </w:t>
       </w:r>
       <w:r>
         <w:t>Solo cambia mediante "Cambio de Turno Sencillo" o "Permanente".</w:t>
@@ -2564,15 +2351,7 @@
         <w:t>AM</w:t>
       </w:r>
       <w:r>
-        <w:t xml:space="preserve"> $\</w:t>
-      </w:r>
-      <w:proofErr w:type="spellStart"/>
-      <w:r>
-        <w:t>rightarrow</w:t>
-      </w:r>
-      <w:proofErr w:type="spellEnd"/>
-      <w:r>
-        <w:t xml:space="preserve">$ Debe solicitar a un Explorador </w:t>
+        <w:t xml:space="preserve"> $\rightarrow$ Debe solicitar a un Explorador </w:t>
       </w:r>
       <w:r>
         <w:rPr>
@@ -2603,15 +2382,7 @@
         <w:t>PM</w:t>
       </w:r>
       <w:r>
-        <w:t xml:space="preserve"> $\</w:t>
-      </w:r>
-      <w:proofErr w:type="spellStart"/>
-      <w:r>
-        <w:t>rightarrow</w:t>
-      </w:r>
-      <w:proofErr w:type="spellEnd"/>
-      <w:r>
-        <w:t xml:space="preserve">$ Debe solicitar a un Explorador </w:t>
+        <w:t xml:space="preserve"> $\rightarrow$ Debe solicitar a un Explorador </w:t>
       </w:r>
       <w:r>
         <w:rPr>
@@ -2869,15 +2640,7 @@
         <w:t>ambos tienen la misma jornada predeterminada</w:t>
       </w:r>
       <w:r>
-        <w:t xml:space="preserve"> (</w:t>
-      </w:r>
-      <w:proofErr w:type="spellStart"/>
-      <w:r>
-        <w:t>Ej</w:t>
-      </w:r>
-      <w:proofErr w:type="spellEnd"/>
-      <w:r>
-        <w:t>: Ambos son AM).</w:t>
+        <w:t xml:space="preserve"> (Ej: Ambos son AM).</w:t>
       </w:r>
     </w:p>
     <w:p>
@@ -2977,39 +2740,7 @@
           <w:b/>
           <w:bCs/>
         </w:rPr>
-        <w:t>6. Restricciones Globales (</w:t>
-      </w:r>
-      <w:proofErr w:type="spellStart"/>
-      <w:r>
-        <w:rPr>
-          <w:b/>
-          <w:bCs/>
-        </w:rPr>
-        <w:t>Hard</w:t>
-      </w:r>
-      <w:proofErr w:type="spellEnd"/>
-      <w:r>
-        <w:rPr>
-          <w:b/>
-          <w:bCs/>
-        </w:rPr>
-        <w:t xml:space="preserve"> </w:t>
-      </w:r>
-      <w:proofErr w:type="spellStart"/>
-      <w:r>
-        <w:rPr>
-          <w:b/>
-          <w:bCs/>
-        </w:rPr>
-        <w:t>Constraints</w:t>
-      </w:r>
-      <w:proofErr w:type="spellEnd"/>
-      <w:r>
-        <w:rPr>
-          <w:b/>
-          <w:bCs/>
-        </w:rPr>
-        <w:t>)</w:t>
+        <w:t>6. Restricciones Globales (Hard Constraints)</w:t>
       </w:r>
     </w:p>
     <w:p>
@@ -3064,7 +2795,7 @@
     <w:p>
       <w:r>
         <w:pict w14:anchorId="77F5A449">
-          <v:rect id="_x0000_i1031" style="width:0;height:1.5pt" o:hralign="center" o:hrstd="t" o:hr="t" fillcolor="#a0a0a0" stroked="f"/>
+          <v:rect id="_x0000_i1025" style="width:0;height:1.5pt" o:hralign="center" o:hrstd="t" o:hr="t" fillcolor="#a0a0a0" stroked="f"/>
         </w:pict>
       </w:r>
     </w:p>
@@ -3179,15 +2910,7 @@
         </w:numPr>
       </w:pPr>
       <w:r>
-        <w:t>Si es inválida: Explica la regla violada y la solución necesaria (</w:t>
-      </w:r>
-      <w:proofErr w:type="spellStart"/>
-      <w:r>
-        <w:t>ej</w:t>
-      </w:r>
-      <w:proofErr w:type="spellEnd"/>
-      <w:r>
-        <w:t>: "Se requiere cambio de turno sencillo").</w:t>
+        <w:t>Si es inválida: Explica la regla violada y la solución necesaria (ej: "Se requiere cambio de turno sencillo").</w:t>
       </w:r>
     </w:p>
     <w:p/>
@@ -6722,6 +6445,7 @@
   <w:style w:type="character" w:default="1" w:styleId="Fuentedeprrafopredeter">
     <w:name w:val="Default Paragraph Font"/>
     <w:uiPriority w:val="1"/>
+    <w:semiHidden/>
     <w:unhideWhenUsed/>
   </w:style>
   <w:style w:type="table" w:default="1" w:styleId="Tablanormal">

</xml_diff>